<commit_message>
Correct 7-Eleven role to Sales Associate
</commit_message>
<xml_diff>
--- a/Erik_Yeghinyan_Resume.docx
+++ b/Erik_Yeghinyan_Resume.docx
@@ -482,7 +482,7 @@
                 <w:color w:val="000000"/>
                 <w:sz w:val="18"/>
               </w:rPr>
-              <w:t>Store Manager</w:t>
+              <w:t>Sales Associate</w:t>
             </w:r>
             <w:r>
               <w:rPr>
@@ -551,7 +551,7 @@
           <w:color w:val="000000"/>
           <w:sz w:val="17"/>
         </w:rPr>
-        <w:t>Managed daily operations across two convenience-store locations and supervised teams of four employees per store, assigning coverage and maintaining dependable service during high-volume and overnight shifts.</w:t>
+        <w:t>Provided fast, accurate customer service during high-volume and overnight shifts, handling purchases, refunds, product questions, and routine service concerns.</w:t>
       </w:r>
     </w:p>
     <w:p>
@@ -583,7 +583,7 @@
           <w:color w:val="000000"/>
           <w:sz w:val="17"/>
         </w:rPr>
-        <w:t>Controlled cash, register reconciliations, inventory, shift records, and incident documentation while reinforcing fraud awareness, safety procedures, and service expectations.</w:t>
+        <w:t>Reconciled registers, restocked merchandise, maintained shift and incident records, and followed fraud-awareness, safety, and loss-prevention procedures.</w:t>
       </w:r>
     </w:p>
     <w:tbl>

</xml_diff>